<commit_message>
feat: enhance backend functionality by adding growth hub venue management, updating membership plan features, and implementing new invoice handling capabilities; introduce new routes and services for venue options and membership plans
</commit_message>
<xml_diff>
--- a/backend/templates/invoice.docx
+++ b/backend/templates/invoice.docx
@@ -288,6 +288,14 @@
             </w:r>
           </w:p>
           <w:p>
+            <w:r>
+              <w:rPr>
+                <w:color w:val="1B1B1F"/>
+              </w:rPr>
+              <w:t xml:space="preserve">{#customer.company}</w:t>
+            </w:r>
+          </w:p>
+          <w:p>
             <w:pPr>
               <w:spacing w:after="40"/>
             </w:pPr>
@@ -296,6 +304,68 @@
                 <w:color w:val="1B1B1F"/>
               </w:rPr>
               <w:t xml:space="preserve">{customer.company}</w:t>
+            </w:r>
+          </w:p>
+          <w:p>
+            <w:r>
+              <w:rPr>
+                <w:color w:val="1B1B1F"/>
+              </w:rPr>
+              <w:t xml:space="preserve">{/customer.company}</w:t>
+            </w:r>
+          </w:p>
+          <w:p>
+            <w:r>
+              <w:rPr>
+                <w:color w:val="1B1B1F"/>
+              </w:rPr>
+              <w:t xml:space="preserve">{#customer.gstin}</w:t>
+            </w:r>
+          </w:p>
+          <w:p>
+            <w:pPr>
+              <w:spacing w:after="40"/>
+            </w:pPr>
+            <w:r>
+              <w:rPr>
+                <w:color w:val="1B1B1F"/>
+              </w:rPr>
+              <w:t xml:space="preserve">GSTIN {customer.gstin}</w:t>
+            </w:r>
+          </w:p>
+          <w:p>
+            <w:r>
+              <w:rPr>
+                <w:color w:val="1B1B1F"/>
+              </w:rPr>
+              <w:t xml:space="preserve">{/customer.gstin}</w:t>
+            </w:r>
+          </w:p>
+          <w:p>
+            <w:r>
+              <w:rPr>
+                <w:color w:val="1B1B1F"/>
+              </w:rPr>
+              <w:t xml:space="preserve">{#customer.address}</w:t>
+            </w:r>
+          </w:p>
+          <w:p>
+            <w:pPr>
+              <w:spacing w:after="40"/>
+            </w:pPr>
+            <w:r>
+              <w:rPr>
+                <w:color w:val="1B1B1F"/>
+              </w:rPr>
+              <w:t xml:space="preserve">{customer.address}</w:t>
+            </w:r>
+          </w:p>
+          <w:p>
+            <w:r>
+              <w:rPr>
+                <w:color w:val="1B1B1F"/>
+              </w:rPr>
+              <w:t xml:space="preserve">{/customer.address}</w:t>
             </w:r>
           </w:p>
           <w:p>

</xml_diff>